<commit_message>
aggiornate lettere intestate per convocazione
</commit_message>
<xml_diff>
--- a/storage/lettere_intestate/lettera_intestata_crc.docx
+++ b/storage/lettere_intestate/lettera_intestata_crc.docx
@@ -1,6 +1,6 @@
 
 <file path=word/document.xml><?xml version="1.0" encoding="utf-8"?>
-<w:document xmlns:wpc="http://schemas.microsoft.com/office/word/2010/wordprocessingCanvas" xmlns:cx="http://schemas.microsoft.com/office/drawing/2014/chartex" xmlns:cx1="http://schemas.microsoft.com/office/drawing/2015/9/8/chartex" xmlns:cx2="http://schemas.microsoft.com/office/drawing/2015/10/21/chartex" xmlns:cx3="http://schemas.microsoft.com/office/drawing/2016/5/9/chartex" xmlns:cx4="http://schemas.microsoft.com/office/drawing/2016/5/10/chartex" xmlns:cx5="http://schemas.microsoft.com/office/drawing/2016/5/11/chartex" xmlns:cx6="http://schemas.microsoft.com/office/drawing/2016/5/12/chartex" xmlns:cx7="http://schemas.microsoft.com/office/drawing/2016/5/13/chartex" xmlns:cx8="http://schemas.microsoft.com/office/drawing/2016/5/14/chartex" xmlns:mc="http://schemas.openxmlformats.org/markup-compatibility/2006" xmlns:aink="http://schemas.microsoft.com/office/drawing/2016/ink" xmlns:am3d="http://schemas.microsoft.com/office/drawing/2017/model3d" xmlns:o="urn:schemas-microsoft-com:office:office" xmlns:r="http://schemas.openxmlformats.org/officeDocument/2006/relationships" xmlns:m="http://schemas.openxmlformats.org/officeDocument/2006/math" xmlns:v="urn:schemas-microsoft-com:vml" xmlns:wp14="http://schemas.microsoft.com/office/word/2010/wordprocessingDrawing" xmlns:wp="http://schemas.openxmlformats.org/drawingml/2006/wordprocessingDrawing" xmlns:w10="urn:schemas-microsoft-com:office:word" xmlns:w="http://schemas.openxmlformats.org/wordprocessingml/2006/main" xmlns:w14="http://schemas.microsoft.com/office/word/2010/wordml" xmlns:w15="http://schemas.microsoft.com/office/word/2012/wordml" xmlns:w16cex="http://schemas.microsoft.com/office/word/2018/wordml/cex" xmlns:w16cid="http://schemas.microsoft.com/office/word/2016/wordml/cid" xmlns:w16="http://schemas.microsoft.com/office/word/2018/wordml" xmlns:w16se="http://schemas.microsoft.com/office/word/2015/wordml/symex" xmlns:wpg="http://schemas.microsoft.com/office/word/2010/wordprocessingGroup" xmlns:wpi="http://schemas.microsoft.com/office/word/2010/wordprocessingInk" xmlns:wne="http://schemas.microsoft.com/office/word/2006/wordml" xmlns:wps="http://schemas.microsoft.com/office/word/2010/wordprocessingShape" mc:Ignorable="w14 w15 w16se w16cid w16 w16cex wp14">
+<w:document xmlns:wpc="http://schemas.microsoft.com/office/word/2010/wordprocessingCanvas" xmlns:cx="http://schemas.microsoft.com/office/drawing/2014/chartex" xmlns:cx1="http://schemas.microsoft.com/office/drawing/2015/9/8/chartex" xmlns:cx2="http://schemas.microsoft.com/office/drawing/2015/10/21/chartex" xmlns:cx3="http://schemas.microsoft.com/office/drawing/2016/5/9/chartex" xmlns:cx4="http://schemas.microsoft.com/office/drawing/2016/5/10/chartex" xmlns:cx5="http://schemas.microsoft.com/office/drawing/2016/5/11/chartex" xmlns:cx6="http://schemas.microsoft.com/office/drawing/2016/5/12/chartex" xmlns:cx7="http://schemas.microsoft.com/office/drawing/2016/5/13/chartex" xmlns:cx8="http://schemas.microsoft.com/office/drawing/2016/5/14/chartex" xmlns:mc="http://schemas.openxmlformats.org/markup-compatibility/2006" xmlns:aink="http://schemas.microsoft.com/office/drawing/2016/ink" xmlns:am3d="http://schemas.microsoft.com/office/drawing/2017/model3d" xmlns:o="urn:schemas-microsoft-com:office:office" xmlns:oel="http://schemas.microsoft.com/office/2019/extlst" xmlns:r="http://schemas.openxmlformats.org/officeDocument/2006/relationships" xmlns:m="http://schemas.openxmlformats.org/officeDocument/2006/math" xmlns:v="urn:schemas-microsoft-com:vml" xmlns:wp14="http://schemas.microsoft.com/office/word/2010/wordprocessingDrawing" xmlns:wp="http://schemas.openxmlformats.org/drawingml/2006/wordprocessingDrawing" xmlns:w10="urn:schemas-microsoft-com:office:word" xmlns:w="http://schemas.openxmlformats.org/wordprocessingml/2006/main" xmlns:w14="http://schemas.microsoft.com/office/word/2010/wordml" xmlns:w15="http://schemas.microsoft.com/office/word/2012/wordml" xmlns:w16cex="http://schemas.microsoft.com/office/word/2018/wordml/cex" xmlns:w16cid="http://schemas.microsoft.com/office/word/2016/wordml/cid" xmlns:w16="http://schemas.microsoft.com/office/word/2018/wordml" xmlns:w16du="http://schemas.microsoft.com/office/word/2023/wordml/word16du" xmlns:w16sdtdh="http://schemas.microsoft.com/office/word/2020/wordml/sdtdatahash" xmlns:w16sdtfl="http://schemas.microsoft.com/office/word/2024/wordml/sdtformatlock" xmlns:w16se="http://schemas.microsoft.com/office/word/2015/wordml/symex" xmlns:wpg="http://schemas.microsoft.com/office/word/2010/wordprocessingGroup" xmlns:wpi="http://schemas.microsoft.com/office/word/2010/wordprocessingInk" xmlns:wne="http://schemas.microsoft.com/office/word/2006/wordml" xmlns:wps="http://schemas.microsoft.com/office/word/2010/wordprocessingShape" mc:Ignorable="w14 w15 w16se w16cid w16 w16cex w16sdtdh w16sdtfl w16du wp14">
   <w:body>
     <w:p>
       <w:pPr>
@@ -52,7 +52,7 @@
                     <pic:cNvPicPr/>
                   </pic:nvPicPr>
                   <pic:blipFill>
-                    <a:blip r:embed="rId4" cstate="print">
+                    <a:blip r:embed="rId5" cstate="print">
                       <a:extLst>
                         <a:ext uri="{28A0092B-C50C-407E-A947-70E740481C1C}">
                           <a14:useLocalDpi xmlns:a14="http://schemas.microsoft.com/office/drawing/2010/main" val="0"/>
@@ -263,13 +263,693 @@
     <w:p>
       <w:pPr>
         <w:ind w:left="1347" w:right="1405"/>
-        <w:jc w:val="center"/>
+        <w:rPr>
+          <w:iCs/>
+          <w:sz w:val="24"/>
+          <w:szCs w:val="40"/>
+          <w:lang w:val="it-IT"/>
+        </w:rPr>
+      </w:pPr>
+    </w:p>
+    <w:p>
+      <w:pPr>
+        <w:ind w:left="1347" w:right="1405"/>
+        <w:rPr>
+          <w:b/>
+          <w:bCs/>
+          <w:iCs/>
+          <w:sz w:val="24"/>
+          <w:szCs w:val="24"/>
+          <w:lang w:val="it-IT"/>
+        </w:rPr>
+      </w:pPr>
+      <w:r>
+        <w:rPr>
+          <w:b/>
+          <w:bCs/>
+          <w:iCs/>
+          <w:sz w:val="24"/>
+          <w:szCs w:val="24"/>
+          <w:lang w:val="it-IT"/>
+        </w:rPr>
+        <w:t>CONVOCAZIONE ARBITRI</w:t>
+      </w:r>
+    </w:p>
+    <w:p>
+      <w:pPr>
+        <w:ind w:left="1347" w:right="1405"/>
+        <w:rPr>
+          <w:iCs/>
+          <w:sz w:val="24"/>
+          <w:szCs w:val="24"/>
+          <w:lang w:val="it-IT"/>
+        </w:rPr>
+      </w:pPr>
+    </w:p>
+    <w:p>
+      <w:pPr>
+        <w:ind w:left="2552" w:right="1405" w:hanging="1134"/>
+        <w:rPr>
+          <w:iCs/>
+          <w:sz w:val="24"/>
+          <w:szCs w:val="24"/>
+          <w:lang w:val="it-IT"/>
+        </w:rPr>
+      </w:pPr>
+      <w:r>
+        <w:rPr>
+          <w:b/>
+          <w:bCs/>
+          <w:iCs/>
+          <w:sz w:val="24"/>
+          <w:szCs w:val="24"/>
+          <w:lang w:val="it-IT"/>
+        </w:rPr>
+        <w:t>Oggetto</w:t>
+      </w:r>
+      <w:r>
+        <w:rPr>
+          <w:iCs/>
+          <w:sz w:val="24"/>
+          <w:szCs w:val="24"/>
+          <w:lang w:val="it-IT"/>
+        </w:rPr>
+        <w:t>: ${</w:t>
+      </w:r>
+      <w:proofErr w:type="spellStart"/>
+      <w:r>
+        <w:rPr>
+          <w:iCs/>
+          <w:sz w:val="24"/>
+          <w:szCs w:val="24"/>
+          <w:lang w:val="it-IT"/>
+        </w:rPr>
+        <w:t>tournament_</w:t>
+      </w:r>
+      <w:proofErr w:type="gramStart"/>
+      <w:r>
+        <w:rPr>
+          <w:iCs/>
+          <w:sz w:val="24"/>
+          <w:szCs w:val="24"/>
+          <w:lang w:val="it-IT"/>
+        </w:rPr>
+        <w:t>name</w:t>
+      </w:r>
+      <w:proofErr w:type="spellEnd"/>
+      <w:r>
+        <w:rPr>
+          <w:iCs/>
+          <w:sz w:val="24"/>
+          <w:szCs w:val="24"/>
+          <w:lang w:val="it-IT"/>
+        </w:rPr>
+        <w:t>}  $</w:t>
+      </w:r>
+      <w:proofErr w:type="gramEnd"/>
+      <w:r>
+        <w:rPr>
+          <w:iCs/>
+          <w:sz w:val="24"/>
+          <w:szCs w:val="24"/>
+          <w:lang w:val="it-IT"/>
+        </w:rPr>
+        <w:t>{</w:t>
+      </w:r>
+      <w:proofErr w:type="spellStart"/>
+      <w:r>
+        <w:rPr>
+          <w:iCs/>
+          <w:sz w:val="24"/>
+          <w:szCs w:val="24"/>
+          <w:lang w:val="it-IT"/>
+        </w:rPr>
+        <w:t>club_name</w:t>
+      </w:r>
+      <w:proofErr w:type="spellEnd"/>
+      <w:r>
+        <w:rPr>
+          <w:iCs/>
+          <w:sz w:val="24"/>
+          <w:szCs w:val="24"/>
+          <w:lang w:val="it-IT"/>
+        </w:rPr>
+        <w:t>} ${</w:t>
+      </w:r>
+      <w:proofErr w:type="spellStart"/>
+      <w:r>
+        <w:rPr>
+          <w:iCs/>
+          <w:sz w:val="24"/>
+          <w:szCs w:val="24"/>
+          <w:lang w:val="it-IT"/>
+        </w:rPr>
+        <w:t>tournament_dates</w:t>
+      </w:r>
+      <w:proofErr w:type="spellEnd"/>
+      <w:r>
+        <w:rPr>
+          <w:iCs/>
+          <w:sz w:val="24"/>
+          <w:szCs w:val="24"/>
+          <w:lang w:val="it-IT"/>
+        </w:rPr>
+        <w:t>}</w:t>
+      </w:r>
+    </w:p>
+    <w:p>
+      <w:pPr>
+        <w:ind w:left="1347" w:right="1405"/>
+        <w:rPr>
+          <w:iCs/>
+          <w:sz w:val="24"/>
+          <w:szCs w:val="24"/>
+          <w:lang w:val="it-IT"/>
+        </w:rPr>
+      </w:pPr>
+    </w:p>
+    <w:p>
+      <w:pPr>
+        <w:ind w:right="1405"/>
+        <w:rPr>
+          <w:iCs/>
+          <w:sz w:val="24"/>
+          <w:szCs w:val="24"/>
+          <w:lang w:val="it-IT"/>
+        </w:rPr>
+      </w:pPr>
+    </w:p>
+    <w:p>
+      <w:pPr>
+        <w:ind w:left="1347" w:right="1405"/>
+        <w:rPr>
+          <w:iCs/>
+          <w:sz w:val="24"/>
+          <w:szCs w:val="24"/>
+          <w:lang w:val="it-IT"/>
+        </w:rPr>
+      </w:pPr>
+      <w:r>
+        <w:rPr>
+          <w:iCs/>
+          <w:sz w:val="24"/>
+          <w:szCs w:val="24"/>
+          <w:lang w:val="it-IT"/>
+        </w:rPr>
+        <w:t>Data: ${</w:t>
+      </w:r>
+      <w:proofErr w:type="spellStart"/>
+      <w:r>
+        <w:rPr>
+          <w:iCs/>
+          <w:sz w:val="24"/>
+          <w:szCs w:val="24"/>
+          <w:lang w:val="it-IT"/>
+        </w:rPr>
+        <w:t>current_date</w:t>
+      </w:r>
+      <w:proofErr w:type="spellEnd"/>
+      <w:r>
+        <w:rPr>
+          <w:iCs/>
+          <w:sz w:val="24"/>
+          <w:szCs w:val="24"/>
+          <w:lang w:val="it-IT"/>
+        </w:rPr>
+        <w:t>}</w:t>
+      </w:r>
+    </w:p>
+    <w:p>
+      <w:pPr>
+        <w:ind w:left="1347" w:right="1405"/>
+        <w:rPr>
+          <w:iCs/>
+          <w:sz w:val="24"/>
+          <w:szCs w:val="24"/>
+          <w:lang w:val="it-IT"/>
+        </w:rPr>
+      </w:pPr>
+    </w:p>
+    <w:p>
+      <w:pPr>
+        <w:ind w:left="1347" w:right="1405"/>
+        <w:jc w:val="both"/>
+        <w:rPr>
+          <w:iCs/>
+          <w:sz w:val="24"/>
+          <w:szCs w:val="24"/>
+          <w:lang w:val="it-IT"/>
+        </w:rPr>
+      </w:pPr>
+      <w:r>
+        <w:rPr>
+          <w:sz w:val="24"/>
+          <w:szCs w:val="24"/>
+          <w:lang w:val="it-IT"/>
+        </w:rPr>
+        <w:t xml:space="preserve">Con la presente si comunica che per la gara in oggetto hanno dato la propria disponibilità a far </w:t>
+      </w:r>
+      <w:r>
+        <w:rPr>
+          <w:iCs/>
+          <w:sz w:val="24"/>
+          <w:szCs w:val="24"/>
+          <w:lang w:val="it-IT"/>
+        </w:rPr>
+        <w:t>parte</w:t>
+      </w:r>
+      <w:r>
+        <w:rPr>
+          <w:iCs/>
+          <w:sz w:val="24"/>
+          <w:szCs w:val="24"/>
+          <w:lang w:val="it-IT"/>
+        </w:rPr>
+        <w:t xml:space="preserve"> </w:t>
+      </w:r>
+      <w:r>
+        <w:rPr>
+          <w:iCs/>
+          <w:sz w:val="24"/>
+          <w:szCs w:val="24"/>
+          <w:lang w:val="it-IT"/>
+        </w:rPr>
+        <w:t>del Comitato di gara, con il possibile ruolo a fianco indicato, gli arbitri di seguito riportati:</w:t>
+      </w:r>
+    </w:p>
+    <w:p>
+      <w:pPr>
+        <w:ind w:left="1347" w:right="1405"/>
+        <w:rPr>
+          <w:iCs/>
+          <w:sz w:val="24"/>
+          <w:szCs w:val="24"/>
+          <w:lang w:val="it-IT"/>
+        </w:rPr>
+      </w:pPr>
+    </w:p>
+    <w:p>
+      <w:pPr>
+        <w:ind w:left="1347" w:right="1405"/>
+        <w:rPr>
+          <w:iCs/>
+          <w:sz w:val="24"/>
+          <w:szCs w:val="24"/>
+          <w:lang w:val="it-IT"/>
+        </w:rPr>
+      </w:pPr>
+      <w:r>
+        <w:rPr>
+          <w:iCs/>
+          <w:sz w:val="24"/>
+          <w:szCs w:val="24"/>
+          <w:lang w:val="it-IT"/>
+        </w:rPr>
+        <w:t>COMITATO DI GARA:</w:t>
+      </w:r>
+    </w:p>
+    <w:tbl>
+      <w:tblPr>
+        <w:tblStyle w:val="Grigliatabella"/>
+        <w:tblW w:w="7720" w:type="dxa"/>
+        <w:tblInd w:w="1347" w:type="dxa"/>
+        <w:tblLook w:val="04A0" w:firstRow="1" w:lastRow="0" w:firstColumn="1" w:lastColumn="0" w:noHBand="0" w:noVBand="1"/>
+      </w:tblPr>
+      <w:tblGrid>
+        <w:gridCol w:w="3503"/>
+        <w:gridCol w:w="4217"/>
+      </w:tblGrid>
+      <w:tr>
+        <w:tc>
+          <w:tcPr>
+            <w:tcW w:w="3410" w:type="dxa"/>
+          </w:tcPr>
+          <w:p>
+            <w:pPr>
+              <w:ind w:right="1405"/>
+              <w:rPr>
+                <w:b/>
+                <w:bCs/>
+                <w:iCs/>
+                <w:sz w:val="24"/>
+                <w:szCs w:val="24"/>
+                <w:lang w:val="it-IT"/>
+              </w:rPr>
+            </w:pPr>
+            <w:r>
+              <w:rPr>
+                <w:b/>
+                <w:bCs/>
+                <w:iCs/>
+                <w:sz w:val="24"/>
+                <w:szCs w:val="24"/>
+                <w:lang w:val="it-IT"/>
+              </w:rPr>
+              <w:t>Nome</w:t>
+            </w:r>
+          </w:p>
+        </w:tc>
+        <w:tc>
+          <w:tcPr>
+            <w:tcW w:w="4310" w:type="dxa"/>
+          </w:tcPr>
+          <w:p>
+            <w:pPr>
+              <w:ind w:right="1405"/>
+              <w:rPr>
+                <w:b/>
+                <w:bCs/>
+                <w:iCs/>
+                <w:sz w:val="24"/>
+                <w:szCs w:val="24"/>
+                <w:lang w:val="it-IT"/>
+              </w:rPr>
+            </w:pPr>
+            <w:r>
+              <w:rPr>
+                <w:b/>
+                <w:bCs/>
+                <w:iCs/>
+                <w:sz w:val="24"/>
+                <w:szCs w:val="24"/>
+                <w:lang w:val="it-IT"/>
+              </w:rPr>
+              <w:t>Ruolo</w:t>
+            </w:r>
+          </w:p>
+        </w:tc>
+      </w:tr>
+      <w:tr>
+        <w:tc>
+          <w:tcPr>
+            <w:tcW w:w="3410" w:type="dxa"/>
+          </w:tcPr>
+          <w:p>
+            <w:pPr>
+              <w:ind w:right="1405"/>
+              <w:rPr>
+                <w:b/>
+                <w:bCs/>
+                <w:iCs/>
+                <w:sz w:val="24"/>
+                <w:szCs w:val="24"/>
+                <w:lang w:val="it-IT"/>
+              </w:rPr>
+            </w:pPr>
+            <w:r>
+              <w:rPr>
+                <w:b/>
+                <w:bCs/>
+                <w:iCs/>
+                <w:sz w:val="24"/>
+                <w:szCs w:val="24"/>
+                <w:lang w:val="it-IT"/>
+              </w:rPr>
+              <w:t>${</w:t>
+            </w:r>
+            <w:proofErr w:type="spellStart"/>
+            <w:r>
+              <w:rPr>
+                <w:b/>
+                <w:bCs/>
+                <w:iCs/>
+                <w:sz w:val="24"/>
+                <w:szCs w:val="24"/>
+                <w:lang w:val="it-IT"/>
+              </w:rPr>
+              <w:t>referee_name</w:t>
+            </w:r>
+            <w:proofErr w:type="spellEnd"/>
+            <w:r>
+              <w:rPr>
+                <w:b/>
+                <w:bCs/>
+                <w:iCs/>
+                <w:sz w:val="24"/>
+                <w:szCs w:val="24"/>
+                <w:lang w:val="it-IT"/>
+              </w:rPr>
+              <w:t>}</w:t>
+            </w:r>
+          </w:p>
+        </w:tc>
+        <w:tc>
+          <w:tcPr>
+            <w:tcW w:w="4310" w:type="dxa"/>
+          </w:tcPr>
+          <w:p>
+            <w:pPr>
+              <w:ind w:right="1405"/>
+              <w:rPr>
+                <w:b/>
+                <w:bCs/>
+                <w:iCs/>
+                <w:sz w:val="24"/>
+                <w:szCs w:val="24"/>
+                <w:lang w:val="it-IT"/>
+              </w:rPr>
+            </w:pPr>
+            <w:r>
+              <w:rPr>
+                <w:b/>
+                <w:bCs/>
+                <w:iCs/>
+                <w:sz w:val="24"/>
+                <w:szCs w:val="24"/>
+                <w:lang w:val="it-IT"/>
+              </w:rPr>
+              <w:t>${</w:t>
+            </w:r>
+            <w:proofErr w:type="spellStart"/>
+            <w:r>
+              <w:rPr>
+                <w:b/>
+                <w:bCs/>
+                <w:iCs/>
+                <w:sz w:val="24"/>
+                <w:szCs w:val="24"/>
+                <w:lang w:val="it-IT"/>
+              </w:rPr>
+              <w:t>referee_role</w:t>
+            </w:r>
+            <w:proofErr w:type="spellEnd"/>
+            <w:r>
+              <w:rPr>
+                <w:b/>
+                <w:bCs/>
+                <w:iCs/>
+                <w:sz w:val="24"/>
+                <w:szCs w:val="24"/>
+                <w:lang w:val="it-IT"/>
+              </w:rPr>
+              <w:t>}</w:t>
+            </w:r>
+          </w:p>
+        </w:tc>
+      </w:tr>
+    </w:tbl>
+    <w:p>
+      <w:pPr>
+        <w:ind w:left="1347" w:right="1405"/>
+        <w:rPr>
+          <w:iCs/>
+          <w:sz w:val="24"/>
+          <w:szCs w:val="24"/>
+          <w:lang w:val="it-IT"/>
+        </w:rPr>
+      </w:pPr>
+    </w:p>
+    <w:p>
+      <w:pPr>
+        <w:ind w:left="1347" w:right="1405"/>
+        <w:rPr>
+          <w:iCs/>
+          <w:sz w:val="24"/>
+          <w:szCs w:val="24"/>
+          <w:lang w:val="it-IT"/>
+        </w:rPr>
+      </w:pPr>
+    </w:p>
+    <w:p>
+      <w:pPr>
+        <w:ind w:left="1347" w:right="1405"/>
+        <w:jc w:val="both"/>
+        <w:rPr>
+          <w:sz w:val="24"/>
+          <w:szCs w:val="24"/>
+          <w:lang w:val="it-IT"/>
+        </w:rPr>
+      </w:pPr>
+      <w:r>
+        <w:rPr>
+          <w:sz w:val="24"/>
+          <w:szCs w:val="24"/>
+          <w:lang w:val="it-IT"/>
+        </w:rPr>
+        <w:t>Si prega cortesemente di inviare tramite e-mail la necessaria convocazione del Comitato di Gara</w:t>
+      </w:r>
+      <w:r>
+        <w:rPr>
+          <w:sz w:val="24"/>
+          <w:szCs w:val="24"/>
+          <w:lang w:val="it-IT"/>
+        </w:rPr>
+        <w:t xml:space="preserve"> </w:t>
+      </w:r>
+      <w:r>
+        <w:rPr>
+          <w:sz w:val="24"/>
+          <w:szCs w:val="24"/>
+          <w:lang w:val="it-IT"/>
+        </w:rPr>
+        <w:t>nonché, per conoscenza, ai seguenti indirizzi:</w:t>
+      </w:r>
+    </w:p>
+    <w:p>
+      <w:pPr>
+        <w:pStyle w:val="Paragrafoelenco"/>
+        <w:numPr>
+          <w:ilvl w:val="1"/>
+          <w:numId w:val="1"/>
+        </w:numPr>
+        <w:ind w:left="1985" w:right="1405"/>
+        <w:jc w:val="both"/>
+        <w:rPr>
+          <w:b/>
+          <w:bCs/>
+          <w:sz w:val="24"/>
+          <w:szCs w:val="24"/>
+          <w:lang w:val="it-IT"/>
+        </w:rPr>
+      </w:pPr>
+      <w:r>
+        <w:rPr>
+          <w:b/>
+          <w:bCs/>
+          <w:sz w:val="24"/>
+          <w:szCs w:val="24"/>
+          <w:lang w:val="it-IT"/>
+        </w:rPr>
+        <w:t>Comitato Regole e Campionati</w:t>
+      </w:r>
+      <w:r>
+        <w:rPr>
+          <w:b/>
+          <w:bCs/>
+          <w:sz w:val="24"/>
+          <w:szCs w:val="24"/>
+          <w:lang w:val="it-IT"/>
+        </w:rPr>
+        <w:t xml:space="preserve"> </w:t>
+      </w:r>
+      <w:r>
+        <w:rPr>
+          <w:b/>
+          <w:bCs/>
+          <w:sz w:val="24"/>
+          <w:szCs w:val="24"/>
+          <w:lang w:val="it-IT"/>
+        </w:rPr>
+        <w:t>crc</w:t>
+      </w:r>
+      <w:r>
+        <w:rPr>
+          <w:b/>
+          <w:bCs/>
+          <w:sz w:val="24"/>
+          <w:szCs w:val="24"/>
+          <w:lang w:val="it-IT"/>
+        </w:rPr>
+        <w:t>@federgolf.it</w:t>
+      </w:r>
+    </w:p>
+    <w:p>
+      <w:pPr>
+        <w:pStyle w:val="Paragrafoelenco"/>
+        <w:numPr>
+          <w:ilvl w:val="1"/>
+          <w:numId w:val="1"/>
+        </w:numPr>
+        <w:ind w:left="1985" w:right="1405"/>
+        <w:jc w:val="both"/>
+        <w:rPr>
+          <w:b/>
+          <w:bCs/>
+          <w:sz w:val="24"/>
+          <w:szCs w:val="24"/>
+          <w:lang w:val="it-IT"/>
+        </w:rPr>
+      </w:pPr>
+      <w:r>
+        <w:rPr>
+          <w:b/>
+          <w:bCs/>
+          <w:sz w:val="24"/>
+          <w:szCs w:val="24"/>
+          <w:lang w:val="it-IT"/>
+        </w:rPr>
+        <w:t>Ufficio Campionati campionati@federgolf.it</w:t>
+      </w:r>
+    </w:p>
+    <w:p>
+      <w:pPr>
+        <w:ind w:left="1347" w:right="1405"/>
+        <w:jc w:val="both"/>
+        <w:rPr>
+          <w:sz w:val="24"/>
+          <w:szCs w:val="24"/>
+          <w:lang w:val="it-IT"/>
+        </w:rPr>
+      </w:pPr>
+    </w:p>
+    <w:p>
+      <w:pPr>
+        <w:ind w:left="1347" w:right="1405"/>
+        <w:jc w:val="both"/>
+        <w:rPr>
+          <w:sz w:val="24"/>
+          <w:szCs w:val="24"/>
+          <w:lang w:val="it-IT"/>
+        </w:rPr>
+      </w:pPr>
+      <w:r>
+        <w:rPr>
+          <w:sz w:val="24"/>
+          <w:szCs w:val="24"/>
+          <w:lang w:val="it-IT"/>
+        </w:rPr>
+        <w:t>Restando a disposizione per ogni chiarimento in merito, porgiamo i più cordiali saluti</w:t>
+      </w:r>
+    </w:p>
+    <w:p>
+      <w:pPr>
+        <w:ind w:left="1347" w:right="1405"/>
+        <w:jc w:val="both"/>
+        <w:rPr>
+          <w:sz w:val="24"/>
+          <w:szCs w:val="24"/>
+          <w:lang w:val="it-IT"/>
+        </w:rPr>
+      </w:pPr>
+    </w:p>
+    <w:p>
+      <w:pPr>
+        <w:ind w:left="1347" w:right="1405"/>
+        <w:jc w:val="right"/>
         <w:rPr>
           <w:i/>
           <w:sz w:val="16"/>
           <w:lang w:val="it-IT"/>
         </w:rPr>
       </w:pPr>
+      <w:r>
+        <w:rPr>
+          <w:sz w:val="24"/>
+          <w:szCs w:val="24"/>
+          <w:lang w:val="it-IT"/>
+        </w:rPr>
+        <w:t>Comitato Regole e Campionati</w:t>
+      </w:r>
     </w:p>
     <w:sectPr>
       <w:type w:val="continuous"/>
@@ -281,8 +961,157 @@
 </w:document>
 </file>
 
+<file path=word/numbering.xml><?xml version="1.0" encoding="utf-8"?>
+<w:numbering xmlns:wpc="http://schemas.microsoft.com/office/word/2010/wordprocessingCanvas" xmlns:cx="http://schemas.microsoft.com/office/drawing/2014/chartex" xmlns:cx1="http://schemas.microsoft.com/office/drawing/2015/9/8/chartex" xmlns:cx2="http://schemas.microsoft.com/office/drawing/2015/10/21/chartex" xmlns:cx3="http://schemas.microsoft.com/office/drawing/2016/5/9/chartex" xmlns:cx4="http://schemas.microsoft.com/office/drawing/2016/5/10/chartex" xmlns:cx5="http://schemas.microsoft.com/office/drawing/2016/5/11/chartex" xmlns:cx6="http://schemas.microsoft.com/office/drawing/2016/5/12/chartex" xmlns:cx7="http://schemas.microsoft.com/office/drawing/2016/5/13/chartex" xmlns:cx8="http://schemas.microsoft.com/office/drawing/2016/5/14/chartex" xmlns:mc="http://schemas.openxmlformats.org/markup-compatibility/2006" xmlns:aink="http://schemas.microsoft.com/office/drawing/2016/ink" xmlns:am3d="http://schemas.microsoft.com/office/drawing/2017/model3d" xmlns:o="urn:schemas-microsoft-com:office:office" xmlns:oel="http://schemas.microsoft.com/office/2019/extlst" xmlns:r="http://schemas.openxmlformats.org/officeDocument/2006/relationships" xmlns:m="http://schemas.openxmlformats.org/officeDocument/2006/math" xmlns:v="urn:schemas-microsoft-com:vml" xmlns:wp14="http://schemas.microsoft.com/office/word/2010/wordprocessingDrawing" xmlns:wp="http://schemas.openxmlformats.org/drawingml/2006/wordprocessingDrawing" xmlns:w10="urn:schemas-microsoft-com:office:word" xmlns:w="http://schemas.openxmlformats.org/wordprocessingml/2006/main" xmlns:w14="http://schemas.microsoft.com/office/word/2010/wordml" xmlns:w15="http://schemas.microsoft.com/office/word/2012/wordml" xmlns:w16cex="http://schemas.microsoft.com/office/word/2018/wordml/cex" xmlns:w16cid="http://schemas.microsoft.com/office/word/2016/wordml/cid" xmlns:w16="http://schemas.microsoft.com/office/word/2018/wordml" xmlns:w16du="http://schemas.microsoft.com/office/word/2023/wordml/word16du" xmlns:w16sdtdh="http://schemas.microsoft.com/office/word/2020/wordml/sdtdatahash" xmlns:w16sdtfl="http://schemas.microsoft.com/office/word/2024/wordml/sdtformatlock" xmlns:w16se="http://schemas.microsoft.com/office/word/2015/wordml/symex" xmlns:wpg="http://schemas.microsoft.com/office/word/2010/wordprocessingGroup" xmlns:wpi="http://schemas.microsoft.com/office/word/2010/wordprocessingInk" xmlns:wne="http://schemas.microsoft.com/office/word/2006/wordml" xmlns:wps="http://schemas.microsoft.com/office/word/2010/wordprocessingShape" mc:Ignorable="w14 w15 w16se w16cid w16 w16cex w16sdtdh w16sdtfl w16du wp14">
+  <w:numPicBullet w:numPicBulletId="0">
+    <w:pict>
+      <v:shapetype id="_x0000_t75" coordsize="21600,21600" o:spt="75" o:preferrelative="t" path="m@4@5l@4@11@9@11@9@5xe" filled="f" stroked="f">
+        <v:stroke joinstyle="miter"/>
+        <v:formulas>
+          <v:f eqn="if lineDrawn pixelLineWidth 0"/>
+          <v:f eqn="sum @0 1 0"/>
+          <v:f eqn="sum 0 0 @1"/>
+          <v:f eqn="prod @2 1 2"/>
+          <v:f eqn="prod @3 21600 pixelWidth"/>
+          <v:f eqn="prod @3 21600 pixelHeight"/>
+          <v:f eqn="sum @0 0 1"/>
+          <v:f eqn="prod @6 1 2"/>
+          <v:f eqn="prod @7 21600 pixelWidth"/>
+          <v:f eqn="sum @8 21600 0"/>
+          <v:f eqn="prod @7 21600 pixelHeight"/>
+          <v:f eqn="sum @10 21600 0"/>
+        </v:formulas>
+        <v:path o:extrusionok="f" gradientshapeok="t" o:connecttype="rect"/>
+        <o:lock v:ext="edit" aspectratio="t"/>
+      </v:shapetype>
+      <v:shape id="_x0000_i1066" type="#_x0000_t75" style="width:5in;height:476pt" o:bullet="t">
+        <v:imagedata r:id="rId1" o:title="bullet"/>
+      </v:shape>
+    </w:pict>
+  </w:numPicBullet>
+  <w:abstractNum w:abstractNumId="0" w15:restartNumberingAfterBreak="0">
+    <w:nsid w:val="3AD77D79"/>
+    <w:multiLevelType w:val="hybridMultilevel"/>
+    <w:tmpl w:val="8B24557A"/>
+    <w:lvl w:ilvl="0" w:tplc="281AC7FA">
+      <w:start w:val="1"/>
+      <w:numFmt w:val="bullet"/>
+      <w:lvlText w:val=""/>
+      <w:lvlJc w:val="left"/>
+      <w:pPr>
+        <w:ind w:left="2067" w:hanging="360"/>
+      </w:pPr>
+      <w:rPr>
+        <w:rFonts w:ascii="Symbol" w:hAnsi="Symbol" w:hint="default"/>
+      </w:rPr>
+    </w:lvl>
+    <w:lvl w:ilvl="1" w:tplc="1494B212">
+      <w:start w:val="1"/>
+      <w:numFmt w:val="bullet"/>
+      <w:lvlText w:val=""/>
+      <w:lvlPicBulletId w:val="0"/>
+      <w:lvlJc w:val="left"/>
+      <w:pPr>
+        <w:ind w:left="1440" w:hanging="360"/>
+      </w:pPr>
+      <w:rPr>
+        <w:rFonts w:ascii="Symbol" w:hAnsi="Symbol" w:hint="default"/>
+        <w:color w:val="auto"/>
+      </w:rPr>
+    </w:lvl>
+    <w:lvl w:ilvl="2" w:tplc="04100005" w:tentative="1">
+      <w:start w:val="1"/>
+      <w:numFmt w:val="bullet"/>
+      <w:lvlText w:val=""/>
+      <w:lvlJc w:val="left"/>
+      <w:pPr>
+        <w:ind w:left="2160" w:hanging="360"/>
+      </w:pPr>
+      <w:rPr>
+        <w:rFonts w:ascii="Wingdings" w:hAnsi="Wingdings" w:hint="default"/>
+      </w:rPr>
+    </w:lvl>
+    <w:lvl w:ilvl="3" w:tplc="04100001" w:tentative="1">
+      <w:start w:val="1"/>
+      <w:numFmt w:val="bullet"/>
+      <w:lvlText w:val=""/>
+      <w:lvlJc w:val="left"/>
+      <w:pPr>
+        <w:ind w:left="2880" w:hanging="360"/>
+      </w:pPr>
+      <w:rPr>
+        <w:rFonts w:ascii="Symbol" w:hAnsi="Symbol" w:hint="default"/>
+      </w:rPr>
+    </w:lvl>
+    <w:lvl w:ilvl="4" w:tplc="04100003" w:tentative="1">
+      <w:start w:val="1"/>
+      <w:numFmt w:val="bullet"/>
+      <w:lvlText w:val="o"/>
+      <w:lvlJc w:val="left"/>
+      <w:pPr>
+        <w:ind w:left="3600" w:hanging="360"/>
+      </w:pPr>
+      <w:rPr>
+        <w:rFonts w:ascii="Courier New" w:hAnsi="Courier New" w:cs="Courier New" w:hint="default"/>
+      </w:rPr>
+    </w:lvl>
+    <w:lvl w:ilvl="5" w:tplc="04100005" w:tentative="1">
+      <w:start w:val="1"/>
+      <w:numFmt w:val="bullet"/>
+      <w:lvlText w:val=""/>
+      <w:lvlJc w:val="left"/>
+      <w:pPr>
+        <w:ind w:left="4320" w:hanging="360"/>
+      </w:pPr>
+      <w:rPr>
+        <w:rFonts w:ascii="Wingdings" w:hAnsi="Wingdings" w:hint="default"/>
+      </w:rPr>
+    </w:lvl>
+    <w:lvl w:ilvl="6" w:tplc="04100001" w:tentative="1">
+      <w:start w:val="1"/>
+      <w:numFmt w:val="bullet"/>
+      <w:lvlText w:val=""/>
+      <w:lvlJc w:val="left"/>
+      <w:pPr>
+        <w:ind w:left="5040" w:hanging="360"/>
+      </w:pPr>
+      <w:rPr>
+        <w:rFonts w:ascii="Symbol" w:hAnsi="Symbol" w:hint="default"/>
+      </w:rPr>
+    </w:lvl>
+    <w:lvl w:ilvl="7" w:tplc="04100003" w:tentative="1">
+      <w:start w:val="1"/>
+      <w:numFmt w:val="bullet"/>
+      <w:lvlText w:val="o"/>
+      <w:lvlJc w:val="left"/>
+      <w:pPr>
+        <w:ind w:left="5760" w:hanging="360"/>
+      </w:pPr>
+      <w:rPr>
+        <w:rFonts w:ascii="Courier New" w:hAnsi="Courier New" w:cs="Courier New" w:hint="default"/>
+      </w:rPr>
+    </w:lvl>
+    <w:lvl w:ilvl="8" w:tplc="04100005" w:tentative="1">
+      <w:start w:val="1"/>
+      <w:numFmt w:val="bullet"/>
+      <w:lvlText w:val=""/>
+      <w:lvlJc w:val="left"/>
+      <w:pPr>
+        <w:ind w:left="6480" w:hanging="360"/>
+      </w:pPr>
+      <w:rPr>
+        <w:rFonts w:ascii="Wingdings" w:hAnsi="Wingdings" w:hint="default"/>
+      </w:rPr>
+    </w:lvl>
+  </w:abstractNum>
+  <w:num w:numId="1" w16cid:durableId="626400448">
+    <w:abstractNumId w:val="0"/>
+  </w:num>
+</w:numbering>
+</file>
+
 <file path=word/styles.xml><?xml version="1.0" encoding="utf-8"?>
-<w:styles xmlns:mc="http://schemas.openxmlformats.org/markup-compatibility/2006" xmlns:r="http://schemas.openxmlformats.org/officeDocument/2006/relationships" xmlns:w="http://schemas.openxmlformats.org/wordprocessingml/2006/main" xmlns:w14="http://schemas.microsoft.com/office/word/2010/wordml" xmlns:w15="http://schemas.microsoft.com/office/word/2012/wordml" xmlns:w16cex="http://schemas.microsoft.com/office/word/2018/wordml/cex" xmlns:w16cid="http://schemas.microsoft.com/office/word/2016/wordml/cid" xmlns:w16="http://schemas.microsoft.com/office/word/2018/wordml" xmlns:w16se="http://schemas.microsoft.com/office/word/2015/wordml/symex" mc:Ignorable="w14 w15 w16se w16cid w16 w16cex">
+<w:styles xmlns:mc="http://schemas.openxmlformats.org/markup-compatibility/2006" xmlns:r="http://schemas.openxmlformats.org/officeDocument/2006/relationships" xmlns:w="http://schemas.openxmlformats.org/wordprocessingml/2006/main" xmlns:w14="http://schemas.microsoft.com/office/word/2010/wordml" xmlns:w15="http://schemas.microsoft.com/office/word/2012/wordml" xmlns:w16cex="http://schemas.microsoft.com/office/word/2018/wordml/cex" xmlns:w16cid="http://schemas.microsoft.com/office/word/2016/wordml/cid" xmlns:w16="http://schemas.microsoft.com/office/word/2018/wordml" xmlns:w16du="http://schemas.microsoft.com/office/word/2023/wordml/word16du" xmlns:w16sdtdh="http://schemas.microsoft.com/office/word/2020/wordml/sdtdatahash" xmlns:w16sdtfl="http://schemas.microsoft.com/office/word/2024/wordml/sdtformatlock" xmlns:w16se="http://schemas.microsoft.com/office/word/2015/wordml/symex" mc:Ignorable="w14 w15 w16se w16cid w16 w16cex w16sdtdh w16sdtfl w16du">
   <w:docDefaults>
     <w:rPrDefault>
       <w:rPr>
@@ -766,6 +1595,22 @@
     <w:uiPriority w:val="1"/>
     <w:qFormat/>
   </w:style>
+  <w:style w:type="table" w:styleId="Grigliatabella">
+    <w:name w:val="Table Grid"/>
+    <w:basedOn w:val="Tabellanormale"/>
+    <w:uiPriority w:val="39"/>
+    <w:rsid w:val="00040D65"/>
+    <w:tblPr>
+      <w:tblBorders>
+        <w:top w:val="single" w:sz="4" w:space="0" w:color="auto"/>
+        <w:left w:val="single" w:sz="4" w:space="0" w:color="auto"/>
+        <w:bottom w:val="single" w:sz="4" w:space="0" w:color="auto"/>
+        <w:right w:val="single" w:sz="4" w:space="0" w:color="auto"/>
+        <w:insideH w:val="single" w:sz="4" w:space="0" w:color="auto"/>
+        <w:insideV w:val="single" w:sz="4" w:space="0" w:color="auto"/>
+      </w:tblBorders>
+    </w:tblPr>
+  </w:style>
 </w:styles>
 </file>
 

</xml_diff>